<commit_message>
docs(system-design): integrate sequence diagram and fix figure numbering in chapter 4
</commit_message>
<xml_diff>
--- a/docs/chapters/CHAPTER 4.docx
+++ b/docs/chapters/CHAPTER 4.docx
@@ -14761,63 +14761,12 @@
       </w:pPr>
       <w:r>
         <w:rPr>
-          <w:rFonts w:eastAsia="Times New Roman" w:cs="Times New Roman"/>
+          <w:rFonts w:ascii="Times New Roman" w:hAnsi="Times New Roman"/>
           <w:b/>
-          <w:bCs/>
-          <w:color w:val="1E293B"/>
+          <w:i/>
           <w:sz w:val="22"/>
         </w:rPr>
-        <w:t xml:space="preserve">Figure 4.7: </w:t>
-      </w:r>
-      <w:r>
-        <w:rPr>
-          <w:rFonts w:eastAsia="Times New Roman" w:cs="Times New Roman"/>
-          <w:b/>
-          <w:bCs/>
-          <w:color w:val="1E293B"/>
-          <w:sz w:val="22"/>
-        </w:rPr>
-        <w:t>Notification</w:t>
-      </w:r>
-      <w:r>
-        <w:rPr>
-          <w:rFonts w:eastAsia="Times New Roman" w:cs="Times New Roman"/>
-          <w:b/>
-          <w:bCs/>
-          <w:color w:val="1E293B"/>
-          <w:sz w:val="22"/>
-        </w:rPr>
-        <w:t xml:space="preserve"> </w:t>
-      </w:r>
-      <w:r>
-        <w:rPr>
-          <w:rFonts w:eastAsia="Times New Roman" w:cs="Times New Roman"/>
-          <w:b/>
-          <w:bCs/>
-          <w:color w:val="1E293B"/>
-          <w:sz w:val="22"/>
-        </w:rPr>
-        <w:t>Module</w:t>
-      </w:r>
-      <w:r>
-        <w:rPr>
-          <w:rFonts w:eastAsia="Times New Roman" w:cs="Times New Roman"/>
-          <w:b/>
-          <w:bCs/>
-          <w:color w:val="1E293B"/>
-          <w:sz w:val="22"/>
-        </w:rPr>
-        <w:t xml:space="preserve"> </w:t>
-      </w:r>
-      <w:r>
-        <w:rPr>
-          <w:rFonts w:eastAsia="Times New Roman" w:cs="Times New Roman"/>
-          <w:b/>
-          <w:bCs/>
-          <w:color w:val="1E293B"/>
-          <w:sz w:val="22"/>
-        </w:rPr>
-        <w:t>Flowchart</w:t>
+        <w:t>Figure 4.8: Notification Module Flowchart</w:t>
       </w:r>
     </w:p>
     <w:p>
@@ -14842,6 +14791,87 @@
           <w:bCs/>
         </w:rPr>
       </w:pPr>
+    </w:p>
+    <w:p>
+      <w:pPr>
+        <w:spacing w:before="280" w:after="80"/>
+      </w:pPr>
+      <w:r>
+        <w:rPr>
+          <w:rFonts w:ascii="Times New Roman" w:hAnsi="Times New Roman"/>
+          <w:b/>
+          <w:sz w:val="26"/>
+        </w:rPr>
+        <w:t>7. Sequence Diagram</w:t>
+      </w:r>
+    </w:p>
+    <w:p>
+      <w:pPr>
+        <w:spacing w:line="276" w:lineRule="auto" w:after="200"/>
+        <w:jc w:val="both"/>
+      </w:pPr>
+      <w:r>
+        <w:rPr>
+          <w:rFonts w:ascii="Times New Roman" w:hAnsi="Times New Roman"/>
+          <w:sz w:val="24"/>
+        </w:rPr>
+        <w:t>The Sequence Diagram models the chronological procedural interactions and message exchanges across system lifelines during an end-to-end disaster response scenario. The sequence illustrates the strict Human-in-the-Loop workflow: a citizen submits an emergency incident report, which is routed to an Emergency Coordinator for initial verification. Upon confirmation, the verified incident triggers the AI Analysis Service to estimate severity and recommend suitable response assets. The officer reviews and confirms the AI recommendations, prompting the system to verify resource availability and dispatch assigned emergency personnel and vehicles, followed by automated citizen status notifications.</w:t>
+      </w:r>
+    </w:p>
+    <w:p>
+      <w:pPr>
+        <w:spacing w:before="120" w:after="80"/>
+        <w:jc w:val="center"/>
+      </w:pPr>
+      <w:r>
+        <w:drawing>
+          <wp:inline xmlns:a="http://schemas.openxmlformats.org/drawingml/2006/main" xmlns:pic="http://schemas.openxmlformats.org/drawingml/2006/picture">
+            <wp:extent cx="5760720" cy="3840480"/>
+            <wp:docPr id="1559246976" name="Picture 1559246976"/>
+            <wp:cNvGraphicFramePr>
+              <a:graphicFrameLocks noChangeAspect="1"/>
+            </wp:cNvGraphicFramePr>
+            <a:graphic>
+              <a:graphicData uri="http://schemas.openxmlformats.org/drawingml/2006/picture">
+                <pic:pic>
+                  <pic:nvPicPr>
+                    <pic:cNvPr id="0" name="SEQUENCE DIAGRAM.png"/>
+                    <pic:cNvPicPr/>
+                  </pic:nvPicPr>
+                  <pic:blipFill>
+                    <a:blip r:embed="rId16"/>
+                    <a:stretch>
+                      <a:fillRect/>
+                    </a:stretch>
+                  </pic:blipFill>
+                  <pic:spPr>
+                    <a:xfrm>
+                      <a:off x="0" y="0"/>
+                      <a:ext cx="5760720" cy="3840480"/>
+                    </a:xfrm>
+                    <a:prstGeom prst="rect"/>
+                  </pic:spPr>
+                </pic:pic>
+              </a:graphicData>
+            </a:graphic>
+          </wp:inline>
+        </w:drawing>
+      </w:r>
+    </w:p>
+    <w:p>
+      <w:pPr>
+        <w:spacing w:before="80" w:after="360"/>
+        <w:jc w:val="center"/>
+      </w:pPr>
+      <w:r>
+        <w:rPr>
+          <w:rFonts w:ascii="Times New Roman" w:hAnsi="Times New Roman"/>
+          <w:b/>
+          <w:i/>
+          <w:sz w:val="22"/>
+        </w:rPr>
+        <w:t>Figure 4.9: Sequence Diagram – Incident Reporting to Response Completion</w:t>
+      </w:r>
     </w:p>
     <w:p>
       <w:pPr>

</xml_diff>

<commit_message>
docs: add A3 fold-out and A4 print-ready vector PDFs and ultra-large legibility diagrams
</commit_message>
<xml_diff>
--- a/docs/chapters/CHAPTER 4.docx
+++ b/docs/chapters/CHAPTER 4.docx
@@ -3677,10 +3677,6 @@
     </w:p>
     <w:p>
       <w:r>
-        <w:rPr>
-          <w:rFonts w:ascii="Times New Roman" w:hAnsi="Times New Roman"/>
-          <w:sz w:val="24"/>
-        </w:rPr>
         <w:t>Stores registered users and their role information. In the physical PostgreSQL implementation, this entity is mapped to the table named 'users' to avoid collision with the PostgreSQL reserved system keyword.</w:t>
       </w:r>
     </w:p>
@@ -5041,6 +5037,7 @@
                 <w:color w:val="0F172A"/>
                 <w:szCs w:val="28"/>
               </w:rPr>
+              <w:lastRenderedPageBreak/>
               <w:t>disaster_type_id</w:t>
             </w:r>
             <w:proofErr w:type="spellEnd"/>
@@ -5095,7 +5092,6 @@
                 <w:color w:val="0F172A"/>
                 <w:szCs w:val="28"/>
               </w:rPr>
-              <w:lastRenderedPageBreak/>
               <w:t>reported_by</w:t>
             </w:r>
             <w:proofErr w:type="spellEnd"/>
@@ -6534,6 +6530,7 @@
         <w:spacing w:after="60"/>
       </w:pPr>
       <w:r>
+        <w:lastRenderedPageBreak/>
         <w:pict w14:anchorId="4763A0C6">
           <v:rect id="_x0000_i1041" style="width:0;height:1.5pt" o:hralign="center" o:hrstd="t" o:hr="t" fillcolor="#a0a0a0" stroked="f"/>
         </w:pict>
@@ -6563,16 +6560,11 @@
           <w:bCs/>
           <w:color w:val="000000"/>
         </w:rPr>
-        <w:lastRenderedPageBreak/>
         <w:t>6. AI_RECOMMENDATION</w:t>
       </w:r>
     </w:p>
     <w:p>
       <w:r>
-        <w:rPr>
-          <w:rFonts w:ascii="Times New Roman" w:hAnsi="Times New Roman"/>
-          <w:sz w:val="24"/>
-        </w:rPr>
         <w:t>Stores the algorithmic assessments generated by the AI decision-support engine, including severity scores, priority ratings, recommended assets, and human-in-the-loop verification attributes (review_status, reviewed_by, reviewed_at) to guarantee operational oversight.</w:t>
       </w:r>
     </w:p>
@@ -7829,6 +7821,7 @@
           <w:rFonts w:eastAsia="Times New Roman" w:cs="Times New Roman"/>
           <w:color w:val="000000"/>
         </w:rPr>
+        <w:lastRenderedPageBreak/>
         <w:t>Stores emergency-response vehicles.</w:t>
       </w:r>
     </w:p>
@@ -7993,7 +7986,6 @@
                 <w:color w:val="0F172A"/>
                 <w:szCs w:val="28"/>
               </w:rPr>
-              <w:lastRenderedPageBreak/>
               <w:t>vehicle_number</w:t>
             </w:r>
             <w:proofErr w:type="spellEnd"/>
@@ -9030,10 +9022,6 @@
     </w:p>
     <w:p>
       <w:r>
-        <w:rPr>
-          <w:rFonts w:ascii="Times New Roman" w:hAnsi="Times New Roman"/>
-          <w:sz w:val="24"/>
-        </w:rPr>
         <w:t>Stores the operational allocation of relief assets to active disaster incidents, tracking the exact quantity_assigned and linking directly to either a resource, vehicle, or equipment entity.</w:t>
       </w:r>
     </w:p>
@@ -9252,6 +9240,7 @@
                 <w:color w:val="0F172A"/>
                 <w:szCs w:val="28"/>
               </w:rPr>
+              <w:lastRenderedPageBreak/>
               <w:t>resource_id</w:t>
             </w:r>
             <w:proofErr w:type="spellEnd"/>
@@ -9414,7 +9403,6 @@
                 <w:color w:val="0F172A"/>
                 <w:szCs w:val="28"/>
               </w:rPr>
-              <w:lastRenderedPageBreak/>
               <w:t>assigned_by</w:t>
             </w:r>
             <w:proofErr w:type="spellEnd"/>
@@ -10576,6 +10564,7 @@
                 <w:color w:val="0F172A"/>
                 <w:szCs w:val="28"/>
               </w:rPr>
+              <w:lastRenderedPageBreak/>
               <w:t>address</w:t>
             </w:r>
           </w:p>
@@ -10733,7 +10722,6 @@
                 <w:color w:val="0F172A"/>
                 <w:szCs w:val="28"/>
               </w:rPr>
-              <w:lastRenderedPageBreak/>
               <w:t>contact_number</w:t>
             </w:r>
             <w:proofErr w:type="spellEnd"/>
@@ -11987,6 +11975,7 @@
                 <w:color w:val="0F172A"/>
                 <w:szCs w:val="28"/>
               </w:rPr>
+              <w:lastRenderedPageBreak/>
               <w:t>parameters</w:t>
             </w:r>
           </w:p>
@@ -12129,7 +12118,6 @@
         <w:spacing w:after="60"/>
       </w:pPr>
       <w:r>
-        <w:lastRenderedPageBreak/>
         <w:pict w14:anchorId="5A5165AE">
           <v:rect id="_x0000_i1050" style="width:0;height:1.5pt" o:hralign="center" o:hrstd="t" o:hr="t" fillcolor="#a0a0a0" stroked="f"/>
         </w:pict>
@@ -13672,10 +13660,6 @@
     </w:p>
     <w:p>
       <w:r>
-        <w:rPr>
-          <w:rFonts w:ascii="Times New Roman" w:hAnsi="Times New Roman"/>
-          <w:sz w:val="24"/>
-        </w:rPr>
         <w:t>Appropriate operational values and business invariants are enforced at the database engine level using PostgreSQL check constraints. For example:</w:t>
       </w:r>
     </w:p>
@@ -13774,6 +13758,7 @@
           <w:bCs/>
           <w:color w:val="000000"/>
         </w:rPr>
+        <w:lastRenderedPageBreak/>
         <w:t>Referential Integrity</w:t>
       </w:r>
     </w:p>
@@ -13783,7 +13768,6 @@
           <w:rFonts w:eastAsia="Times New Roman" w:cs="Times New Roman"/>
           <w:color w:val="000000"/>
         </w:rPr>
-        <w:lastRenderedPageBreak/>
         <w:t>Foreign-key relationships prevent invalid references between related records.</w:t>
       </w:r>
     </w:p>
@@ -14142,13 +14126,48 @@
     </w:p>
     <w:p>
       <w:pPr>
-        <w:spacing w:before="120"/>
+        <w:spacing w:before="160" w:after="80"/>
         <w:jc w:val="center"/>
         <w:rPr>
           <w:b/>
           <w:bCs/>
         </w:rPr>
       </w:pPr>
+      <w:r/>
+      <w:r>
+        <w:drawing>
+          <wp:inline xmlns:a="http://schemas.openxmlformats.org/drawingml/2006/main" xmlns:pic="http://schemas.openxmlformats.org/drawingml/2006/picture">
+            <wp:extent cx="5760720" cy="6311377"/>
+            <wp:docPr id="1559246977" name="Picture 1559246977"/>
+            <wp:cNvGraphicFramePr>
+              <a:graphicFrameLocks noChangeAspect="1"/>
+            </wp:cNvGraphicFramePr>
+            <a:graphic>
+              <a:graphicData uri="http://schemas.openxmlformats.org/drawingml/2006/picture">
+                <pic:pic>
+                  <pic:nvPicPr>
+                    <pic:cNvPr id="0" name="FlowChart_Readable.png"/>
+                    <pic:cNvPicPr/>
+                  </pic:nvPicPr>
+                  <pic:blipFill>
+                    <a:blip r:embed="rId17"/>
+                    <a:stretch>
+                      <a:fillRect/>
+                    </a:stretch>
+                  </pic:blipFill>
+                  <pic:spPr>
+                    <a:xfrm>
+                      <a:off x="0" y="0"/>
+                      <a:ext cx="5760720" cy="6311377"/>
+                    </a:xfrm>
+                    <a:prstGeom prst="rect"/>
+                  </pic:spPr>
+                </pic:pic>
+              </a:graphicData>
+            </a:graphic>
+          </wp:inline>
+        </w:drawing>
+      </w:r>
     </w:p>
     <w:p>
       <w:pPr>
@@ -14215,9 +14234,9 @@
         </w:rPr>
         <w:lastRenderedPageBreak/>
         <w:drawing>
-          <wp:inline distT="0" distB="0" distL="0" distR="0" wp14:anchorId="107BFC77" wp14:editId="29EF459B">
-            <wp:extent cx="3172475" cy="7863840"/>
-            <wp:effectExtent l="0" t="0" r="9525" b="0"/>
+          <wp:inline distT="0" distB="0" distL="0" distR="0" wp14:anchorId="107BFC77" wp14:editId="71C32F63">
+            <wp:extent cx="3310466" cy="8205888"/>
+            <wp:effectExtent l="0" t="0" r="4445" b="5080"/>
             <wp:docPr id="926461222" name="Picture 7"/>
             <wp:cNvGraphicFramePr>
               <a:graphicFrameLocks xmlns:a="http://schemas.openxmlformats.org/drawingml/2006/main" noChangeAspect="1"/>
@@ -14247,7 +14266,7 @@
                   <pic:spPr bwMode="auto">
                     <a:xfrm>
                       <a:off x="0" y="0"/>
-                      <a:ext cx="3172475" cy="7863840"/>
+                      <a:ext cx="3314944" cy="8216989"/>
                     </a:xfrm>
                     <a:prstGeom prst="rect">
                       <a:avLst/>
@@ -14309,9 +14328,9 @@
         </w:rPr>
         <w:lastRenderedPageBreak/>
         <w:drawing>
-          <wp:inline distT="0" distB="0" distL="0" distR="0" wp14:anchorId="3C7E07B2" wp14:editId="35E7171C">
-            <wp:extent cx="3560644" cy="7863840"/>
-            <wp:effectExtent l="0" t="0" r="8255" b="0"/>
+          <wp:inline distT="0" distB="0" distL="0" distR="0" wp14:anchorId="3C7E07B2" wp14:editId="4B4C5C2B">
+            <wp:extent cx="3742069" cy="8264525"/>
+            <wp:effectExtent l="0" t="0" r="0" b="3175"/>
             <wp:docPr id="240127497" name="Picture 9"/>
             <wp:cNvGraphicFramePr>
               <a:graphicFrameLocks xmlns:a="http://schemas.openxmlformats.org/drawingml/2006/main" noChangeAspect="1"/>
@@ -14341,7 +14360,7 @@
                   <pic:spPr bwMode="auto">
                     <a:xfrm>
                       <a:off x="0" y="0"/>
-                      <a:ext cx="3560644" cy="7863840"/>
+                      <a:ext cx="3748978" cy="8279784"/>
                     </a:xfrm>
                     <a:prstGeom prst="rect">
                       <a:avLst/>
@@ -14459,9 +14478,9 @@
         </w:rPr>
         <w:lastRenderedPageBreak/>
         <w:drawing>
-          <wp:inline distT="0" distB="0" distL="0" distR="0" wp14:anchorId="396CDDD2" wp14:editId="7719DAAD">
-            <wp:extent cx="3559664" cy="7863840"/>
-            <wp:effectExtent l="0" t="0" r="0" b="0"/>
+          <wp:inline distT="0" distB="0" distL="0" distR="0" wp14:anchorId="396CDDD2" wp14:editId="6C1CCA32">
+            <wp:extent cx="3633249" cy="8026400"/>
+            <wp:effectExtent l="0" t="0" r="5715" b="0"/>
             <wp:docPr id="1319034377" name="Picture 11"/>
             <wp:cNvGraphicFramePr>
               <a:graphicFrameLocks xmlns:a="http://schemas.openxmlformats.org/drawingml/2006/main" noChangeAspect="1"/>
@@ -14491,7 +14510,7 @@
                   <pic:spPr bwMode="auto">
                     <a:xfrm>
                       <a:off x="0" y="0"/>
-                      <a:ext cx="3559664" cy="7863840"/>
+                      <a:ext cx="3642851" cy="8047612"/>
                     </a:xfrm>
                     <a:prstGeom prst="rect">
                       <a:avLst/>
@@ -14596,9 +14615,9 @@
         </w:rPr>
         <w:lastRenderedPageBreak/>
         <w:drawing>
-          <wp:inline distT="0" distB="0" distL="0" distR="0" wp14:anchorId="52D4C7A2" wp14:editId="2DA03B90">
-            <wp:extent cx="3738324" cy="7863840"/>
-            <wp:effectExtent l="0" t="0" r="0" b="5715"/>
+          <wp:inline distT="0" distB="0" distL="0" distR="0" wp14:anchorId="52D4C7A2" wp14:editId="4065B1A7">
+            <wp:extent cx="3826933" cy="8050236"/>
+            <wp:effectExtent l="0" t="0" r="2540" b="8255"/>
             <wp:docPr id="1049646799" name="Picture 13"/>
             <wp:cNvGraphicFramePr>
               <a:graphicFrameLocks xmlns:a="http://schemas.openxmlformats.org/drawingml/2006/main" noChangeAspect="1"/>
@@ -14628,7 +14647,7 @@
                   <pic:spPr bwMode="auto">
                     <a:xfrm>
                       <a:off x="0" y="0"/>
-                      <a:ext cx="3738324" cy="7863840"/>
+                      <a:ext cx="3833046" cy="8063094"/>
                     </a:xfrm>
                     <a:prstGeom prst="rect">
                       <a:avLst/>
@@ -14701,9 +14720,17 @@
         </w:rPr>
         <w:lastRenderedPageBreak/>
         <w:drawing>
-          <wp:inline distT="0" distB="0" distL="0" distR="0" wp14:anchorId="30B45F1D" wp14:editId="5175C1FF">
-            <wp:extent cx="3519607" cy="7863840"/>
-            <wp:effectExtent l="0" t="0" r="6985" b="0"/>
+          <wp:anchor distT="0" distB="0" distL="114300" distR="114300" simplePos="0" relativeHeight="251662336" behindDoc="0" locked="0" layoutInCell="1" allowOverlap="1" wp14:anchorId="30B45F1D" wp14:editId="0516239B">
+            <wp:simplePos x="0" y="0"/>
+            <wp:positionH relativeFrom="column">
+              <wp:posOffset>1100455</wp:posOffset>
+            </wp:positionH>
+            <wp:positionV relativeFrom="paragraph">
+              <wp:posOffset>0</wp:posOffset>
+            </wp:positionV>
+            <wp:extent cx="3691255" cy="8248650"/>
+            <wp:effectExtent l="0" t="0" r="4445" b="0"/>
+            <wp:wrapTopAndBottom/>
             <wp:docPr id="1559246974" name="Picture 14"/>
             <wp:cNvGraphicFramePr>
               <a:graphicFrameLocks xmlns:a="http://schemas.openxmlformats.org/drawingml/2006/main" noChangeAspect="1"/>
@@ -14733,7 +14760,7 @@
                   <pic:spPr bwMode="auto">
                     <a:xfrm>
                       <a:off x="0" y="0"/>
-                      <a:ext cx="3519607" cy="7863840"/>
+                      <a:ext cx="3691255" cy="8248650"/>
                     </a:xfrm>
                     <a:prstGeom prst="rect">
                       <a:avLst/>
@@ -14746,7 +14773,13 @@
                 </pic:pic>
               </a:graphicData>
             </a:graphic>
-          </wp:inline>
+            <wp14:sizeRelH relativeFrom="margin">
+              <wp14:pctWidth>0</wp14:pctWidth>
+            </wp14:sizeRelH>
+            <wp14:sizeRelV relativeFrom="margin">
+              <wp14:pctHeight>0</wp14:pctHeight>
+            </wp14:sizeRelV>
+          </wp:anchor>
         </w:drawing>
       </w:r>
     </w:p>
@@ -14761,7 +14794,6 @@
       </w:pPr>
       <w:r>
         <w:rPr>
-          <w:rFonts w:ascii="Times New Roman" w:hAnsi="Times New Roman"/>
           <w:b/>
           <w:i/>
           <w:sz w:val="22"/>
@@ -14778,6 +14810,7 @@
         </w:rPr>
       </w:pPr>
       <w:r>
+        <w:lastRenderedPageBreak/>
         <w:pict w14:anchorId="3C5E133C">
           <v:rect id="_x0000_i1061" style="width:0;height:1.5pt" o:hralign="center" o:hrstd="t" o:hr="t" fillcolor="#a0a0a0" stroked="f"/>
         </w:pict>
@@ -14798,7 +14831,6 @@
       </w:pPr>
       <w:r>
         <w:rPr>
-          <w:rFonts w:ascii="Times New Roman" w:hAnsi="Times New Roman"/>
           <w:b/>
           <w:sz w:val="26"/>
         </w:rPr>
@@ -14807,39 +14839,43 @@
     </w:p>
     <w:p>
       <w:pPr>
-        <w:spacing w:line="276" w:lineRule="auto" w:after="200"/>
-        <w:jc w:val="both"/>
-      </w:pPr>
-      <w:r>
-        <w:rPr>
-          <w:rFonts w:ascii="Times New Roman" w:hAnsi="Times New Roman"/>
-          <w:sz w:val="24"/>
-        </w:rPr>
-        <w:t>The Sequence Diagram models the chronological procedural interactions and message exchanges across system lifelines during an end-to-end disaster response scenario. The sequence illustrates the strict Human-in-the-Loop workflow: a citizen submits an emergency incident report, which is routed to an Emergency Coordinator for initial verification. Upon confirmation, the verified incident triggers the AI Analysis Service to estimate severity and recommend suitable response assets. The officer reviews and confirms the AI recommendations, prompting the system to verify resource availability and dispatch assigned emergency personnel and vehicles, followed by automated citizen status notifications.</w:t>
-      </w:r>
-    </w:p>
-    <w:p>
-      <w:pPr>
-        <w:spacing w:before="120" w:after="80"/>
-        <w:jc w:val="center"/>
-      </w:pPr>
-      <w:r>
+        <w:spacing w:after="200"/>
+      </w:pPr>
+      <w:r>
+        <w:rPr>
+          <w:noProof/>
+        </w:rPr>
         <w:drawing>
-          <wp:inline xmlns:a="http://schemas.openxmlformats.org/drawingml/2006/main" xmlns:pic="http://schemas.openxmlformats.org/drawingml/2006/picture">
-            <wp:extent cx="5760720" cy="3840480"/>
+          <wp:anchor distT="0" distB="0" distL="114300" distR="114300" simplePos="0" relativeHeight="251661312" behindDoc="0" locked="0" layoutInCell="1" allowOverlap="1" wp14:anchorId="1A431380" wp14:editId="149A4F61">
+            <wp:simplePos x="0" y="0"/>
+            <wp:positionH relativeFrom="page">
+              <wp:align>left</wp:align>
+            </wp:positionH>
+            <wp:positionV relativeFrom="paragraph">
+              <wp:posOffset>1737360</wp:posOffset>
+            </wp:positionV>
+            <wp:extent cx="7531099" cy="5020733"/>
+            <wp:effectExtent l="0" t="0" r="0" b="8890"/>
+            <wp:wrapSquare wrapText="bothSides"/>
             <wp:docPr id="1559246976" name="Picture 1559246976"/>
             <wp:cNvGraphicFramePr>
-              <a:graphicFrameLocks noChangeAspect="1"/>
+              <a:graphicFrameLocks xmlns:a="http://schemas.openxmlformats.org/drawingml/2006/main" noChangeAspect="1"/>
             </wp:cNvGraphicFramePr>
-            <a:graphic>
+            <a:graphic xmlns:a="http://schemas.openxmlformats.org/drawingml/2006/main">
               <a:graphicData uri="http://schemas.openxmlformats.org/drawingml/2006/picture">
-                <pic:pic>
+                <pic:pic xmlns:pic="http://schemas.openxmlformats.org/drawingml/2006/picture">
                   <pic:nvPicPr>
                     <pic:cNvPr id="0" name="SEQUENCE DIAGRAM.png"/>
                     <pic:cNvPicPr/>
                   </pic:nvPicPr>
                   <pic:blipFill>
-                    <a:blip r:embed="rId16"/>
+                    <a:blip r:embed="rId14">
+                      <a:extLst>
+                        <a:ext uri="{28A0092B-C50C-407E-A947-70E740481C1C}">
+                          <a14:useLocalDpi xmlns:a14="http://schemas.microsoft.com/office/drawing/2010/main" val="0"/>
+                        </a:ext>
+                      </a:extLst>
+                    </a:blip>
                     <a:stretch>
                       <a:fillRect/>
                     </a:stretch>
@@ -14847,16 +14883,33 @@
                   <pic:spPr>
                     <a:xfrm>
                       <a:off x="0" y="0"/>
-                      <a:ext cx="5760720" cy="3840480"/>
+                      <a:ext cx="7531099" cy="5020733"/>
                     </a:xfrm>
-                    <a:prstGeom prst="rect"/>
+                    <a:prstGeom prst="rect">
+                      <a:avLst/>
+                    </a:prstGeom>
                   </pic:spPr>
                 </pic:pic>
               </a:graphicData>
             </a:graphic>
-          </wp:inline>
+            <wp14:sizeRelH relativeFrom="margin">
+              <wp14:pctWidth>0</wp14:pctWidth>
+            </wp14:sizeRelH>
+            <wp14:sizeRelV relativeFrom="margin">
+              <wp14:pctHeight>0</wp14:pctHeight>
+            </wp14:sizeRelV>
+          </wp:anchor>
         </w:drawing>
       </w:r>
+      <w:r>
+        <w:t>The Sequence Diagram models the chronological procedural interactions and message exchanges across system lifelines during an end-to-end disaster response scenario. The sequence illustrates the strict Human-in-the-Loop workflow: a citizen submits an emergency incident report, which is routed to an Emergency Coordinator for initial verification. Upon confirmation, the verified incident triggers the AI Analysis Service to estimate severity and recommend suitable response assets. The officer reviews and confirms the AI recommendations, prompting the system to verify resource availability and dispatch assigned emergency personnel and vehicles, followed by automated citizen status notifications.</w:t>
+      </w:r>
+    </w:p>
+    <w:p>
+      <w:pPr>
+        <w:spacing w:before="120" w:after="80"/>
+        <w:jc w:val="center"/>
+      </w:pPr>
     </w:p>
     <w:p>
       <w:pPr>
@@ -14865,7 +14918,6 @@
       </w:pPr>
       <w:r>
         <w:rPr>
-          <w:rFonts w:ascii="Times New Roman" w:hAnsi="Times New Roman"/>
           <w:b/>
           <w:i/>
           <w:sz w:val="22"/>
@@ -14891,7 +14943,6 @@
           <w:color w:val="000000"/>
           <w:sz w:val="25"/>
         </w:rPr>
-        <w:lastRenderedPageBreak/>
         <w:t>4.3.2 Data Structures</w:t>
       </w:r>
     </w:p>
@@ -14918,6 +14969,7 @@
           <w:bCs/>
           <w:color w:val="000000"/>
         </w:rPr>
+        <w:lastRenderedPageBreak/>
         <w:t>User Object</w:t>
       </w:r>
     </w:p>
@@ -15613,71 +15665,71 @@
           <w:rFonts w:eastAsia="Times New Roman" w:cs="Times New Roman"/>
           <w:color w:val="000000"/>
         </w:rPr>
+        <w:t xml:space="preserve"> </w:t>
+      </w:r>
+      <w:r>
+        <w:rPr>
+          <w:rFonts w:eastAsia="Times New Roman" w:cs="Times New Roman" w:hint="eastAsia"/>
+          <w:color w:val="000000"/>
+        </w:rPr>
+        <w:t>├</w:t>
+      </w:r>
+      <w:r>
+        <w:rPr>
+          <w:rFonts w:eastAsia="Times New Roman" w:cs="Times New Roman"/>
+          <w:color w:val="000000"/>
+        </w:rPr>
+        <w:t xml:space="preserve">── </w:t>
+      </w:r>
+      <w:proofErr w:type="spellStart"/>
+      <w:r>
+        <w:rPr>
+          <w:rFonts w:eastAsia="Times New Roman" w:cs="Times New Roman"/>
+          <w:color w:val="000000"/>
+        </w:rPr>
+        <w:t>resource_id</w:t>
+      </w:r>
+      <w:proofErr w:type="spellEnd"/>
+    </w:p>
+    <w:p>
+      <w:r>
+        <w:rPr>
+          <w:rFonts w:eastAsia="Times New Roman" w:cs="Times New Roman"/>
+          <w:color w:val="000000"/>
+        </w:rPr>
+        <w:t xml:space="preserve"> </w:t>
+      </w:r>
+      <w:r>
+        <w:rPr>
+          <w:rFonts w:eastAsia="Times New Roman" w:cs="Times New Roman" w:hint="eastAsia"/>
+          <w:color w:val="000000"/>
+        </w:rPr>
+        <w:t>├</w:t>
+      </w:r>
+      <w:r>
+        <w:rPr>
+          <w:rFonts w:eastAsia="Times New Roman" w:cs="Times New Roman"/>
+          <w:color w:val="000000"/>
+        </w:rPr>
+        <w:t xml:space="preserve">── </w:t>
+      </w:r>
+      <w:proofErr w:type="spellStart"/>
+      <w:r>
+        <w:rPr>
+          <w:rFonts w:eastAsia="Times New Roman" w:cs="Times New Roman"/>
+          <w:color w:val="000000"/>
+        </w:rPr>
+        <w:t>vehicle_id</w:t>
+      </w:r>
+      <w:proofErr w:type="spellEnd"/>
+    </w:p>
+    <w:p>
+      <w:r>
+        <w:rPr>
+          <w:rFonts w:eastAsia="Times New Roman" w:cs="Times New Roman"/>
+          <w:color w:val="000000"/>
+        </w:rPr>
         <w:lastRenderedPageBreak/>
-        <w:t xml:space="preserve"> </w:t>
-      </w:r>
-      <w:r>
-        <w:rPr>
-          <w:rFonts w:eastAsia="Times New Roman" w:cs="Times New Roman" w:hint="eastAsia"/>
-          <w:color w:val="000000"/>
-        </w:rPr>
-        <w:t>├</w:t>
-      </w:r>
-      <w:r>
-        <w:rPr>
-          <w:rFonts w:eastAsia="Times New Roman" w:cs="Times New Roman"/>
-          <w:color w:val="000000"/>
-        </w:rPr>
-        <w:t xml:space="preserve">── </w:t>
-      </w:r>
-      <w:proofErr w:type="spellStart"/>
-      <w:r>
-        <w:rPr>
-          <w:rFonts w:eastAsia="Times New Roman" w:cs="Times New Roman"/>
-          <w:color w:val="000000"/>
-        </w:rPr>
-        <w:t>resource_id</w:t>
-      </w:r>
-      <w:proofErr w:type="spellEnd"/>
-    </w:p>
-    <w:p>
-      <w:r>
-        <w:rPr>
-          <w:rFonts w:eastAsia="Times New Roman" w:cs="Times New Roman"/>
-          <w:color w:val="000000"/>
-        </w:rPr>
-        <w:t xml:space="preserve"> </w:t>
-      </w:r>
-      <w:r>
-        <w:rPr>
-          <w:rFonts w:eastAsia="Times New Roman" w:cs="Times New Roman" w:hint="eastAsia"/>
-          <w:color w:val="000000"/>
-        </w:rPr>
-        <w:t>├</w:t>
-      </w:r>
-      <w:r>
-        <w:rPr>
-          <w:rFonts w:eastAsia="Times New Roman" w:cs="Times New Roman"/>
-          <w:color w:val="000000"/>
-        </w:rPr>
-        <w:t xml:space="preserve">── </w:t>
-      </w:r>
-      <w:proofErr w:type="spellStart"/>
-      <w:r>
-        <w:rPr>
-          <w:rFonts w:eastAsia="Times New Roman" w:cs="Times New Roman"/>
-          <w:color w:val="000000"/>
-        </w:rPr>
-        <w:t>vehicle_id</w:t>
-      </w:r>
-      <w:proofErr w:type="spellEnd"/>
-    </w:p>
-    <w:p>
-      <w:r>
-        <w:rPr>
-          <w:rFonts w:eastAsia="Times New Roman" w:cs="Times New Roman"/>
-          <w:color w:val="000000"/>
-        </w:rPr>
         <w:t xml:space="preserve"> </w:t>
       </w:r>
       <w:r>
@@ -16015,7 +16067,6 @@
           <w:rFonts w:eastAsia="Times New Roman" w:cs="Times New Roman"/>
           <w:color w:val="000000"/>
         </w:rPr>
-        <w:lastRenderedPageBreak/>
         <w:t xml:space="preserve">        Send incident for AI analysis.</w:t>
       </w:r>
     </w:p>
@@ -16043,6 +16094,7 @@
           <w:bCs/>
           <w:color w:val="000000"/>
         </w:rPr>
+        <w:lastRenderedPageBreak/>
         <w:t>Algorithm 3: AI-Assisted Incident Analysis</w:t>
       </w:r>
     </w:p>
@@ -16329,7 +16381,6 @@
           <w:sz w:val="28"/>
           <w:szCs w:val="28"/>
         </w:rPr>
-        <w:lastRenderedPageBreak/>
         <w:t>4.4 User Interface Design</w:t>
       </w:r>
     </w:p>
@@ -16360,6 +16411,7 @@
           <w:color w:val="000000"/>
           <w:sz w:val="25"/>
         </w:rPr>
+        <w:lastRenderedPageBreak/>
         <w:t>4.4.1 Login Page</w:t>
       </w:r>
     </w:p>
@@ -16774,7 +16826,6 @@
           <w:rFonts w:eastAsia="Times New Roman" w:cs="Times New Roman"/>
           <w:color w:val="000000"/>
         </w:rPr>
-        <w:lastRenderedPageBreak/>
         <w:t xml:space="preserve">User management. </w:t>
       </w:r>
     </w:p>
@@ -16805,6 +16856,7 @@
           <w:rFonts w:eastAsia="Times New Roman" w:cs="Times New Roman"/>
           <w:color w:val="000000"/>
         </w:rPr>
+        <w:lastRenderedPageBreak/>
         <w:t xml:space="preserve">Resource management. </w:t>
       </w:r>
     </w:p>
@@ -17179,7 +17231,6 @@
           <w:rFonts w:eastAsia="Times New Roman" w:cs="Times New Roman"/>
           <w:color w:val="000000"/>
         </w:rPr>
-        <w:lastRenderedPageBreak/>
         <w:t xml:space="preserve">   ↓</w:t>
       </w:r>
     </w:p>

</xml_diff>

<commit_message>
docs(chapters): integrate high-legibility large-font Gantt charts and restore original ERD
</commit_message>
<xml_diff>
--- a/docs/chapters/CHAPTER 4.docx
+++ b/docs/chapters/CHAPTER 4.docx
@@ -2190,52 +2190,38 @@
       </w:r>
     </w:p>
     <w:p>
-      <w:r>
-        <w:rPr>
-          <w:noProof/>
-        </w:rPr>
+      <w:pPr>
+        <w:spacing w:before="160" w:after="80"/>
+        <w:jc w:val="center"/>
+      </w:pPr>
+      <w:r/>
+      <w:r>
         <w:drawing>
-          <wp:inline distT="0" distB="0" distL="0" distR="0" wp14:anchorId="69CD6352" wp14:editId="56CD8B16">
-            <wp:extent cx="5731510" cy="3820795"/>
-            <wp:effectExtent l="0" t="0" r="2540" b="8255"/>
-            <wp:docPr id="131387952" name="Picture 1"/>
+          <wp:inline xmlns:a="http://schemas.openxmlformats.org/drawingml/2006/main" xmlns:pic="http://schemas.openxmlformats.org/drawingml/2006/picture">
+            <wp:extent cx="5852160" cy="3904269"/>
+            <wp:docPr id="1559246975" name="Picture 1559246975"/>
             <wp:cNvGraphicFramePr>
-              <a:graphicFrameLocks xmlns:a="http://schemas.openxmlformats.org/drawingml/2006/main" noChangeAspect="1"/>
+              <a:graphicFrameLocks noChangeAspect="1"/>
             </wp:cNvGraphicFramePr>
-            <a:graphic xmlns:a="http://schemas.openxmlformats.org/drawingml/2006/main">
+            <a:graphic>
               <a:graphicData uri="http://schemas.openxmlformats.org/drawingml/2006/picture">
-                <pic:pic xmlns:pic="http://schemas.openxmlformats.org/drawingml/2006/picture">
+                <pic:pic>
                   <pic:nvPicPr>
-                    <pic:cNvPr id="0" name="Picture 43"/>
-                    <pic:cNvPicPr>
-                      <a:picLocks noChangeAspect="1" noChangeArrowheads="1"/>
-                    </pic:cNvPicPr>
+                    <pic:cNvPr id="0" name="image.png"/>
+                    <pic:cNvPicPr/>
                   </pic:nvPicPr>
                   <pic:blipFill>
-                    <a:blip r:embed="rId5" cstate="print">
-                      <a:extLst>
-                        <a:ext uri="{28A0092B-C50C-407E-A947-70E740481C1C}">
-                          <a14:useLocalDpi xmlns:a14="http://schemas.microsoft.com/office/drawing/2010/main" val="0"/>
-                        </a:ext>
-                      </a:extLst>
-                    </a:blip>
-                    <a:srcRect/>
+                    <a:blip r:embed="rId5"/>
                     <a:stretch>
                       <a:fillRect/>
                     </a:stretch>
                   </pic:blipFill>
-                  <pic:spPr bwMode="auto">
+                  <pic:spPr>
                     <a:xfrm>
                       <a:off x="0" y="0"/>
-                      <a:ext cx="5731510" cy="3820795"/>
+                      <a:ext cx="5852160" cy="3904269"/>
                     </a:xfrm>
-                    <a:prstGeom prst="rect">
-                      <a:avLst/>
-                    </a:prstGeom>
-                    <a:noFill/>
-                    <a:ln>
-                      <a:noFill/>
-                    </a:ln>
+                    <a:prstGeom prst="rect"/>
                   </pic:spPr>
                 </pic:pic>
               </a:graphicData>
@@ -8164,7 +8150,7 @@
         <w:drawing>
           <wp:inline xmlns:a="http://schemas.openxmlformats.org/drawingml/2006/main" xmlns:pic="http://schemas.openxmlformats.org/drawingml/2006/picture">
             <wp:extent cx="5852160" cy="4328772"/>
-            <wp:docPr id="1559246975" name="Picture 1559246975"/>
+            <wp:docPr id="1559246976" name="Picture 1559246976"/>
             <wp:cNvGraphicFramePr>
               <a:graphicFrameLocks noChangeAspect="1"/>
             </wp:cNvGraphicFramePr>
@@ -8686,7 +8672,7 @@
         <w:drawing>
           <wp:inline xmlns:a="http://schemas.openxmlformats.org/drawingml/2006/main" xmlns:pic="http://schemas.openxmlformats.org/drawingml/2006/picture">
             <wp:extent cx="1690124" cy="7772400"/>
-            <wp:docPr id="1559246976" name="Picture 1559246976"/>
+            <wp:docPr id="1559246977" name="Picture 1559246977"/>
             <wp:cNvGraphicFramePr>
               <a:graphicFrameLocks noChangeAspect="1"/>
             </wp:cNvGraphicFramePr>
@@ -9289,7 +9275,7 @@
         <w:drawing>
           <wp:inline xmlns:a="http://schemas.openxmlformats.org/drawingml/2006/main" xmlns:pic="http://schemas.openxmlformats.org/drawingml/2006/picture">
             <wp:extent cx="5852160" cy="3901440"/>
-            <wp:docPr id="1" name="Picture 1"/>
+            <wp:docPr id="1559246978" name="Picture 1559246978"/>
             <wp:cNvGraphicFramePr>
               <a:graphicFrameLocks noChangeAspect="1"/>
             </wp:cNvGraphicFramePr>
@@ -9301,7 +9287,7 @@
                     <pic:cNvPicPr/>
                   </pic:nvPicPr>
                   <pic:blipFill>
-                    <a:blip r:embed="rId9"/>
+                    <a:blip r:embed="rId16"/>
                     <a:stretch>
                       <a:fillRect/>
                     </a:stretch>
@@ -9322,7 +9308,6 @@
     </w:p>
     <w:p>
       <w:pPr>
-        <w:pStyle w:val="Normal"/>
         <w:jc w:val="center"/>
       </w:pPr>
       <w:r>

</xml_diff>

<commit_message>
docs(chapters): sync HD Use Case diagram and standardized 16-table Database Design
</commit_message>
<xml_diff>
--- a/docs/chapters/CHAPTER 4.docx
+++ b/docs/chapters/CHAPTER 4.docx
@@ -8149,7 +8149,7 @@
       <w:r>
         <w:drawing>
           <wp:inline xmlns:a="http://schemas.openxmlformats.org/drawingml/2006/main" xmlns:pic="http://schemas.openxmlformats.org/drawingml/2006/picture">
-            <wp:extent cx="5852160" cy="4328772"/>
+            <wp:extent cx="5852160" cy="3779520"/>
             <wp:docPr id="1559246976" name="Picture 1559246976"/>
             <wp:cNvGraphicFramePr>
               <a:graphicFrameLocks noChangeAspect="1"/>
@@ -8158,11 +8158,11 @@
               <a:graphicData uri="http://schemas.openxmlformats.org/drawingml/2006/picture">
                 <pic:pic>
                   <pic:nvPicPr>
-                    <pic:cNvPr id="0" name="image.png"/>
+                    <pic:cNvPr id="0" name="Database_Design_Standardized.png"/>
                     <pic:cNvPicPr/>
                   </pic:nvPicPr>
                   <pic:blipFill>
-                    <a:blip r:embed="rId6"/>
+                    <a:blip r:embed="rId15"/>
                     <a:stretch>
                       <a:fillRect/>
                     </a:stretch>
@@ -8170,7 +8170,7 @@
                   <pic:spPr>
                     <a:xfrm>
                       <a:off x="0" y="0"/>
-                      <a:ext cx="5852160" cy="4328772"/>
+                      <a:ext cx="5852160" cy="3779520"/>
                     </a:xfrm>
                     <a:prstGeom prst="rect"/>
                   </pic:spPr>
@@ -8684,7 +8684,7 @@
                     <pic:cNvPicPr/>
                   </pic:nvPicPr>
                   <pic:blipFill>
-                    <a:blip r:embed="rId15"/>
+                    <a:blip r:embed="rId16"/>
                     <a:stretch>
                       <a:fillRect/>
                     </a:stretch>
@@ -9287,7 +9287,7 @@
                     <pic:cNvPicPr/>
                   </pic:nvPicPr>
                   <pic:blipFill>
-                    <a:blip r:embed="rId16"/>
+                    <a:blip r:embed="rId17"/>
                     <a:stretch>
                       <a:fillRect/>
                     </a:stretch>

</xml_diff>

<commit_message>
docs(chapters): update Chapter 3 and 4 with ultra-high resolution vector diagrams
</commit_message>
<xml_diff>
--- a/docs/chapters/CHAPTER 4.docx
+++ b/docs/chapters/CHAPTER 4.docx
@@ -2198,7 +2198,7 @@
       <w:r>
         <w:drawing>
           <wp:inline xmlns:a="http://schemas.openxmlformats.org/drawingml/2006/main" xmlns:pic="http://schemas.openxmlformats.org/drawingml/2006/picture">
-            <wp:extent cx="5852160" cy="3904269"/>
+            <wp:extent cx="5852160" cy="3862426"/>
             <wp:docPr id="1559246975" name="Picture 1559246975"/>
             <wp:cNvGraphicFramePr>
               <a:graphicFrameLocks noChangeAspect="1"/>
@@ -2207,11 +2207,11 @@
               <a:graphicData uri="http://schemas.openxmlformats.org/drawingml/2006/picture">
                 <pic:pic>
                   <pic:nvPicPr>
-                    <pic:cNvPr id="0" name="image.png"/>
+                    <pic:cNvPr id="0" name="ERD_VECTOR.png"/>
                     <pic:cNvPicPr/>
                   </pic:nvPicPr>
                   <pic:blipFill>
-                    <a:blip r:embed="rId5"/>
+                    <a:blip r:embed="rId15"/>
                     <a:stretch>
                       <a:fillRect/>
                     </a:stretch>
@@ -2219,7 +2219,7 @@
                   <pic:spPr>
                     <a:xfrm>
                       <a:off x="0" y="0"/>
-                      <a:ext cx="5852160" cy="3904269"/>
+                      <a:ext cx="5852160" cy="3862426"/>
                     </a:xfrm>
                     <a:prstGeom prst="rect"/>
                   </pic:spPr>
@@ -8149,7 +8149,7 @@
       <w:r>
         <w:drawing>
           <wp:inline xmlns:a="http://schemas.openxmlformats.org/drawingml/2006/main" xmlns:pic="http://schemas.openxmlformats.org/drawingml/2006/picture">
-            <wp:extent cx="5852160" cy="3779520"/>
+            <wp:extent cx="5852160" cy="3745382"/>
             <wp:docPr id="1559246976" name="Picture 1559246976"/>
             <wp:cNvGraphicFramePr>
               <a:graphicFrameLocks noChangeAspect="1"/>
@@ -8158,11 +8158,11 @@
               <a:graphicData uri="http://schemas.openxmlformats.org/drawingml/2006/picture">
                 <pic:pic>
                   <pic:nvPicPr>
-                    <pic:cNvPr id="0" name="Database_Design_Standardized.png"/>
+                    <pic:cNvPr id="0" name="Database_Design_Workbench.png"/>
                     <pic:cNvPicPr/>
                   </pic:nvPicPr>
                   <pic:blipFill>
-                    <a:blip r:embed="rId15"/>
+                    <a:blip r:embed="rId16"/>
                     <a:stretch>
                       <a:fillRect/>
                     </a:stretch>
@@ -8170,7 +8170,7 @@
                   <pic:spPr>
                     <a:xfrm>
                       <a:off x="0" y="0"/>
-                      <a:ext cx="5852160" cy="3779520"/>
+                      <a:ext cx="5852160" cy="3745382"/>
                     </a:xfrm>
                     <a:prstGeom prst="rect"/>
                   </pic:spPr>
@@ -8684,7 +8684,7 @@
                     <pic:cNvPicPr/>
                   </pic:nvPicPr>
                   <pic:blipFill>
-                    <a:blip r:embed="rId16"/>
+                    <a:blip r:embed="rId17"/>
                     <a:stretch>
                       <a:fillRect/>
                     </a:stretch>
@@ -9287,7 +9287,7 @@
                     <pic:cNvPicPr/>
                   </pic:nvPicPr>
                   <pic:blipFill>
-                    <a:blip r:embed="rId17"/>
+                    <a:blip r:embed="rId18"/>
                     <a:stretch>
                       <a:fillRect/>
                     </a:stretch>

</xml_diff>